<commit_message>
Add standalone custom converter and specific pandoc template route
</commit_message>
<xml_diff>
--- a/custom_template.docx
+++ b/custom_template.docx
@@ -3,9 +3,6 @@
 <w:document xmlns:wpc="http://schemas.microsoft.com/office/word/2010/wordprocessingCanvas" xmlns:cx="http://schemas.microsoft.com/office/drawing/2014/chartex" xmlns:cx1="http://schemas.microsoft.com/office/drawing/2015/9/8/chartex" xmlns:cx2="http://schemas.microsoft.com/office/drawing/2015/10/21/chartex" xmlns:cx3="http://schemas.microsoft.com/office/drawing/2016/5/9/chartex" xmlns:cx4="http://schemas.microsoft.com/office/drawing/2016/5/10/chartex" xmlns:cx5="http://schemas.microsoft.com/office/drawing/2016/5/11/chartex" xmlns:cx6="http://schemas.microsoft.com/office/drawing/2016/5/12/chartex" xmlns:cx7="http://schemas.microsoft.com/office/drawing/2016/5/13/chartex" xmlns:cx8="http://schemas.microsoft.com/office/drawing/2016/5/14/chartex" xmlns:mc="http://schemas.openxmlformats.org/markup-compatibility/2006" xmlns:aink="http://schemas.microsoft.com/office/drawing/2016/ink" xmlns:am3d="http://schemas.microsoft.com/office/drawing/2017/model3d" xmlns:o="urn:schemas-microsoft-com:office:office" xmlns:r="http://schemas.openxmlformats.org/officeDocument/2006/relationships" xmlns:m="http://schemas.openxmlformats.org/officeDocument/2006/math" xmlns:v="urn:schemas-microsoft-com:vml" xmlns:wp14="http://schemas.microsoft.com/office/word/2010/wordprocessingDrawing" xmlns:wp="http://schemas.openxmlformats.org/drawingml/2006/wordprocessingDrawing" xmlns:w10="urn:schemas-microsoft-com:office:word" xmlns:w="http://schemas.openxmlformats.org/wordprocessingml/2006/main" xmlns:w14="http://schemas.microsoft.com/office/word/2010/wordml" xmlns:w15="http://schemas.microsoft.com/office/word/2012/wordml" xmlns:w16cid="http://schemas.microsoft.com/office/word/2016/wordml/cid" xmlns:w16se="http://schemas.microsoft.com/office/word/2015/wordml/symex" xmlns:wpg="http://schemas.microsoft.com/office/word/2010/wordprocessingGroup" xmlns:wpi="http://schemas.microsoft.com/office/word/2010/wordprocessingInk" xmlns:wne="http://schemas.microsoft.com/office/word/2006/wordml" xmlns:wps="http://schemas.microsoft.com/office/word/2010/wordprocessingShape" mc:Ignorable="w14 w15 w16se w16cid wp14">
   <w:body>
     <w:p>
-      <w:pPr>
-        <w:pStyle w:val="Heading2"/>
-      </w:pPr>
       <w:bookmarkStart w:id="0" w:name="_GoBack"/>
       <w:bookmarkEnd w:id="0"/>
     </w:p>
@@ -431,16 +428,17 @@
     <w:link w:val="Heading1Char"/>
     <w:uiPriority w:val="9"/>
     <w:qFormat/>
-    <w:rsid w:val="00656653"/>
+    <w:rsid w:val="00E471FA"/>
     <w:pPr>
       <w:keepNext/>
       <w:keepLines/>
       <w:shd w:val="clear" w:color="auto" w:fill="808080" w:themeFill="background1" w:themeFillShade="80"/>
-      <w:spacing w:before="240" w:after="0"/>
+      <w:spacing w:before="240" w:after="120"/>
       <w:outlineLvl w:val="0"/>
     </w:pPr>
     <w:rPr>
       <w:rFonts w:asciiTheme="majorHAnsi" w:eastAsiaTheme="majorEastAsia" w:hAnsiTheme="majorHAnsi" w:cstheme="majorBidi"/>
+      <w:b/>
       <w:color w:val="FFFFFF" w:themeColor="background1"/>
       <w:sz w:val="28"/>
       <w:szCs w:val="32"/>
@@ -513,9 +511,10 @@
     <w:basedOn w:val="DefaultParagraphFont"/>
     <w:link w:val="Heading1"/>
     <w:uiPriority w:val="9"/>
-    <w:rsid w:val="00656653"/>
+    <w:rsid w:val="00E471FA"/>
     <w:rPr>
       <w:rFonts w:asciiTheme="majorHAnsi" w:eastAsiaTheme="majorEastAsia" w:hAnsiTheme="majorHAnsi" w:cstheme="majorBidi"/>
+      <w:b/>
       <w:color w:val="FFFFFF" w:themeColor="background1"/>
       <w:sz w:val="28"/>
       <w:szCs w:val="32"/>
@@ -578,23 +577,21 @@
     <w:name w:val="Table Grid"/>
     <w:basedOn w:val="TableNormal"/>
     <w:uiPriority w:val="39"/>
-    <w:rsid w:val="00656653"/>
+    <w:rsid w:val="00E471FA"/>
     <w:pPr>
       <w:spacing w:after="0" w:line="240" w:lineRule="auto"/>
     </w:pPr>
     <w:tblPr>
       <w:tblBorders>
-        <w:top w:val="single" w:sz="4" w:space="0" w:color="A6A6A6" w:themeColor="background1" w:themeShade="A6"/>
-        <w:left w:val="single" w:sz="4" w:space="0" w:color="A6A6A6" w:themeColor="background1" w:themeShade="A6"/>
-        <w:bottom w:val="single" w:sz="4" w:space="0" w:color="A6A6A6" w:themeColor="background1" w:themeShade="A6"/>
-        <w:right w:val="single" w:sz="4" w:space="0" w:color="A6A6A6" w:themeColor="background1" w:themeShade="A6"/>
-        <w:insideH w:val="single" w:sz="4" w:space="0" w:color="A6A6A6" w:themeColor="background1" w:themeShade="A6"/>
-        <w:insideV w:val="single" w:sz="4" w:space="0" w:color="A6A6A6" w:themeColor="background1" w:themeShade="A6"/>
+        <w:top w:val="single" w:sz="8" w:space="0" w:color="A6A6A6" w:themeColor="background1" w:themeShade="A6"/>
+        <w:left w:val="single" w:sz="8" w:space="0" w:color="A6A6A6" w:themeColor="background1" w:themeShade="A6"/>
+        <w:bottom w:val="single" w:sz="8" w:space="0" w:color="A6A6A6" w:themeColor="background1" w:themeShade="A6"/>
+        <w:right w:val="single" w:sz="8" w:space="0" w:color="A6A6A6" w:themeColor="background1" w:themeShade="A6"/>
       </w:tblBorders>
       <w:tblCellMar>
-        <w:top w:w="115" w:type="dxa"/>
+        <w:top w:w="144" w:type="dxa"/>
         <w:left w:w="115" w:type="dxa"/>
-        <w:bottom w:w="115" w:type="dxa"/>
+        <w:bottom w:w="144" w:type="dxa"/>
         <w:right w:w="115" w:type="dxa"/>
       </w:tblCellMar>
     </w:tblPr>

</xml_diff>

<commit_message>
Update custom docx template styles
</commit_message>
<xml_diff>
--- a/custom_template.docx
+++ b/custom_template.docx
@@ -577,7 +577,7 @@
     <w:name w:val="Table Grid"/>
     <w:basedOn w:val="TableNormal"/>
     <w:uiPriority w:val="39"/>
-    <w:rsid w:val="00E471FA"/>
+    <w:rsid w:val="009022C2"/>
     <w:pPr>
       <w:spacing w:after="0" w:line="240" w:lineRule="auto"/>
     </w:pPr>
@@ -587,6 +587,7 @@
         <w:left w:val="single" w:sz="8" w:space="0" w:color="A6A6A6" w:themeColor="background1" w:themeShade="A6"/>
         <w:bottom w:val="single" w:sz="8" w:space="0" w:color="A6A6A6" w:themeColor="background1" w:themeShade="A6"/>
         <w:right w:val="single" w:sz="8" w:space="0" w:color="A6A6A6" w:themeColor="background1" w:themeShade="A6"/>
+        <w:insideV w:val="single" w:sz="8" w:space="0" w:color="A6A6A6" w:themeColor="background1" w:themeShade="A6"/>
       </w:tblBorders>
       <w:tblCellMar>
         <w:top w:w="144" w:type="dxa"/>
@@ -904,4 +905,306 @@
     </a:ext>
   </a:extLst>
 </a:theme>
+</file>
+
+<file path=customXml/item1.xml><?xml version="1.0" encoding="utf-8"?>
+<ct:contentTypeSchema xmlns:ct="http://schemas.microsoft.com/office/2006/metadata/contentType" xmlns:ma="http://schemas.microsoft.com/office/2006/metadata/properties/metaAttributes" ct:_="" ma:_="" ma:contentTypeName="Document" ma:contentTypeID="0x010100327EB354E14D304C9C108F11A9B154A1" ma:contentTypeVersion="16" ma:contentTypeDescription="Create a new document." ma:contentTypeScope="" ma:versionID="f872d239368d3730efb26fdf84048400">
+  <xsd:schema xmlns:xsd="http://www.w3.org/2001/XMLSchema" xmlns:xs="http://www.w3.org/2001/XMLSchema" xmlns:p="http://schemas.microsoft.com/office/2006/metadata/properties" xmlns:ns3="937081f2-661d-4493-9d28-7214e1e6d6f0" xmlns:ns4="5a52e74c-1c86-40cb-b161-6acf8542837e" targetNamespace="http://schemas.microsoft.com/office/2006/metadata/properties" ma:root="true" ma:fieldsID="a52a305483ac62a56302ecef9fc9764b" ns3:_="" ns4:_="">
+    <xsd:import namespace="937081f2-661d-4493-9d28-7214e1e6d6f0"/>
+    <xsd:import namespace="5a52e74c-1c86-40cb-b161-6acf8542837e"/>
+    <xsd:element name="properties">
+      <xsd:complexType>
+        <xsd:sequence>
+          <xsd:element name="documentManagement">
+            <xsd:complexType>
+              <xsd:all>
+                <xsd:element ref="ns3:MediaServiceMetadata" minOccurs="0"/>
+                <xsd:element ref="ns3:MediaServiceFastMetadata" minOccurs="0"/>
+                <xsd:element ref="ns3:MediaServiceDateTaken" minOccurs="0"/>
+                <xsd:element ref="ns4:SharedWithUsers" minOccurs="0"/>
+                <xsd:element ref="ns4:SharedWithDetails" minOccurs="0"/>
+                <xsd:element ref="ns4:SharingHintHash" minOccurs="0"/>
+                <xsd:element ref="ns3:MediaServiceAutoKeyPoints" minOccurs="0"/>
+                <xsd:element ref="ns3:MediaServiceKeyPoints" minOccurs="0"/>
+                <xsd:element ref="ns3:MediaServiceObjectDetectorVersions" minOccurs="0"/>
+                <xsd:element ref="ns3:_activity" minOccurs="0"/>
+                <xsd:element ref="ns3:MediaServiceSystemTags" minOccurs="0"/>
+                <xsd:element ref="ns3:MediaServiceOCR" minOccurs="0"/>
+                <xsd:element ref="ns3:MediaServiceGenerationTime" minOccurs="0"/>
+                <xsd:element ref="ns3:MediaServiceEventHashCode" minOccurs="0"/>
+                <xsd:element ref="ns3:MediaServiceSearchProperties" minOccurs="0"/>
+                <xsd:element ref="ns3:MediaServiceLocation" minOccurs="0"/>
+              </xsd:all>
+            </xsd:complexType>
+          </xsd:element>
+        </xsd:sequence>
+      </xsd:complexType>
+    </xsd:element>
+  </xsd:schema>
+  <xsd:schema xmlns:xsd="http://www.w3.org/2001/XMLSchema" xmlns:xs="http://www.w3.org/2001/XMLSchema" xmlns:dms="http://schemas.microsoft.com/office/2006/documentManagement/types" xmlns:pc="http://schemas.microsoft.com/office/infopath/2007/PartnerControls" targetNamespace="937081f2-661d-4493-9d28-7214e1e6d6f0" elementFormDefault="qualified">
+    <xsd:import namespace="http://schemas.microsoft.com/office/2006/documentManagement/types"/>
+    <xsd:import namespace="http://schemas.microsoft.com/office/infopath/2007/PartnerControls"/>
+    <xsd:element name="MediaServiceMetadata" ma:index="8" nillable="true" ma:displayName="MediaServiceMetadata" ma:description="" ma:hidden="true" ma:internalName="MediaServiceMetadata" ma:readOnly="true">
+      <xsd:simpleType>
+        <xsd:restriction base="dms:Note"/>
+      </xsd:simpleType>
+    </xsd:element>
+    <xsd:element name="MediaServiceFastMetadata" ma:index="9" nillable="true" ma:displayName="MediaServiceFastMetadata" ma:description="" ma:hidden="true" ma:internalName="MediaServiceFastMetadata" ma:readOnly="true">
+      <xsd:simpleType>
+        <xsd:restriction base="dms:Note"/>
+      </xsd:simpleType>
+    </xsd:element>
+    <xsd:element name="MediaServiceDateTaken" ma:index="10" nillable="true" ma:displayName="MediaServiceDateTaken" ma:hidden="true" ma:internalName="MediaServiceDateTaken" ma:readOnly="true">
+      <xsd:simpleType>
+        <xsd:restriction base="dms:Text"/>
+      </xsd:simpleType>
+    </xsd:element>
+    <xsd:element name="MediaServiceAutoKeyPoints" ma:index="14" nillable="true" ma:displayName="MediaServiceAutoKeyPoints" ma:hidden="true" ma:internalName="MediaServiceAutoKeyPoints" ma:readOnly="true">
+      <xsd:simpleType>
+        <xsd:restriction base="dms:Note"/>
+      </xsd:simpleType>
+    </xsd:element>
+    <xsd:element name="MediaServiceKeyPoints" ma:index="15" nillable="true" ma:displayName="KeyPoints" ma:internalName="MediaServiceKeyPoints" ma:readOnly="true">
+      <xsd:simpleType>
+        <xsd:restriction base="dms:Note">
+          <xsd:maxLength value="255"/>
+        </xsd:restriction>
+      </xsd:simpleType>
+    </xsd:element>
+    <xsd:element name="MediaServiceObjectDetectorVersions" ma:index="16" nillable="true" ma:displayName="MediaServiceObjectDetectorVersions" ma:hidden="true" ma:indexed="true" ma:internalName="MediaServiceObjectDetectorVersions" ma:readOnly="true">
+      <xsd:simpleType>
+        <xsd:restriction base="dms:Text"/>
+      </xsd:simpleType>
+    </xsd:element>
+    <xsd:element name="_activity" ma:index="17" nillable="true" ma:displayName="_activity" ma:hidden="true" ma:internalName="_activity">
+      <xsd:simpleType>
+        <xsd:restriction base="dms:Note"/>
+      </xsd:simpleType>
+    </xsd:element>
+    <xsd:element name="MediaServiceSystemTags" ma:index="18" nillable="true" ma:displayName="MediaServiceSystemTags" ma:hidden="true" ma:internalName="MediaServiceSystemTags" ma:readOnly="true">
+      <xsd:simpleType>
+        <xsd:restriction base="dms:Note"/>
+      </xsd:simpleType>
+    </xsd:element>
+    <xsd:element name="MediaServiceOCR" ma:index="19" nillable="true" ma:displayName="Extracted Text" ma:internalName="MediaServiceOCR" ma:readOnly="true">
+      <xsd:simpleType>
+        <xsd:restriction base="dms:Note">
+          <xsd:maxLength value="255"/>
+        </xsd:restriction>
+      </xsd:simpleType>
+    </xsd:element>
+    <xsd:element name="MediaServiceGenerationTime" ma:index="20" nillable="true" ma:displayName="MediaServiceGenerationTime" ma:hidden="true" ma:internalName="MediaServiceGenerationTime" ma:readOnly="true">
+      <xsd:simpleType>
+        <xsd:restriction base="dms:Text"/>
+      </xsd:simpleType>
+    </xsd:element>
+    <xsd:element name="MediaServiceEventHashCode" ma:index="21" nillable="true" ma:displayName="MediaServiceEventHashCode" ma:hidden="true" ma:internalName="MediaServiceEventHashCode" ma:readOnly="true">
+      <xsd:simpleType>
+        <xsd:restriction base="dms:Text"/>
+      </xsd:simpleType>
+    </xsd:element>
+    <xsd:element name="MediaServiceSearchProperties" ma:index="22" nillable="true" ma:displayName="MediaServiceSearchProperties" ma:hidden="true" ma:internalName="MediaServiceSearchProperties" ma:readOnly="true">
+      <xsd:simpleType>
+        <xsd:restriction base="dms:Note"/>
+      </xsd:simpleType>
+    </xsd:element>
+    <xsd:element name="MediaServiceLocation" ma:index="23" nillable="true" ma:displayName="Location" ma:indexed="true" ma:internalName="MediaServiceLocation" ma:readOnly="true">
+      <xsd:simpleType>
+        <xsd:restriction base="dms:Text"/>
+      </xsd:simpleType>
+    </xsd:element>
+  </xsd:schema>
+  <xsd:schema xmlns:xsd="http://www.w3.org/2001/XMLSchema" xmlns:xs="http://www.w3.org/2001/XMLSchema" xmlns:dms="http://schemas.microsoft.com/office/2006/documentManagement/types" xmlns:pc="http://schemas.microsoft.com/office/infopath/2007/PartnerControls" targetNamespace="5a52e74c-1c86-40cb-b161-6acf8542837e" elementFormDefault="qualified">
+    <xsd:import namespace="http://schemas.microsoft.com/office/2006/documentManagement/types"/>
+    <xsd:import namespace="http://schemas.microsoft.com/office/infopath/2007/PartnerControls"/>
+    <xsd:element name="SharedWithUsers" ma:index="11" nillable="true" ma:displayName="Shared With" ma:internalName="SharedWithUsers" ma:readOnly="true">
+      <xsd:complexType>
+        <xsd:complexContent>
+          <xsd:extension base="dms:UserMulti">
+            <xsd:sequence>
+              <xsd:element name="UserInfo" minOccurs="0" maxOccurs="unbounded">
+                <xsd:complexType>
+                  <xsd:sequence>
+                    <xsd:element name="DisplayName" type="xsd:string" minOccurs="0"/>
+                    <xsd:element name="AccountId" type="dms:UserId" minOccurs="0" nillable="true"/>
+                    <xsd:element name="AccountType" type="xsd:string" minOccurs="0"/>
+                  </xsd:sequence>
+                </xsd:complexType>
+              </xsd:element>
+            </xsd:sequence>
+          </xsd:extension>
+        </xsd:complexContent>
+      </xsd:complexType>
+    </xsd:element>
+    <xsd:element name="SharedWithDetails" ma:index="12" nillable="true" ma:displayName="Shared With Details" ma:internalName="SharedWithDetails" ma:readOnly="true">
+      <xsd:simpleType>
+        <xsd:restriction base="dms:Note">
+          <xsd:maxLength value="255"/>
+        </xsd:restriction>
+      </xsd:simpleType>
+    </xsd:element>
+    <xsd:element name="SharingHintHash" ma:index="13" nillable="true" ma:displayName="Sharing Hint Hash" ma:hidden="true" ma:internalName="SharingHintHash" ma:readOnly="true">
+      <xsd:simpleType>
+        <xsd:restriction base="dms:Text"/>
+      </xsd:simpleType>
+    </xsd:element>
+  </xsd:schema>
+  <xsd:schema xmlns="http://schemas.openxmlformats.org/package/2006/metadata/core-properties" xmlns:xsd="http://www.w3.org/2001/XMLSchema" xmlns:xsi="http://www.w3.org/2001/XMLSchema-instance" xmlns:dc="http://purl.org/dc/elements/1.1/" xmlns:dcterms="http://purl.org/dc/terms/" xmlns:odoc="http://schemas.microsoft.com/internal/obd" targetNamespace="http://schemas.openxmlformats.org/package/2006/metadata/core-properties" elementFormDefault="qualified" attributeFormDefault="unqualified" blockDefault="#all">
+    <xsd:import namespace="http://purl.org/dc/elements/1.1/" schemaLocation="http://dublincore.org/schemas/xmls/qdc/2003/04/02/dc.xsd"/>
+    <xsd:import namespace="http://purl.org/dc/terms/" schemaLocation="http://dublincore.org/schemas/xmls/qdc/2003/04/02/dcterms.xsd"/>
+    <xsd:element name="coreProperties" type="CT_coreProperties"/>
+    <xsd:complexType name="CT_coreProperties">
+      <xsd:all>
+        <xsd:element ref="dc:creator" minOccurs="0" maxOccurs="1"/>
+        <xsd:element ref="dcterms:created" minOccurs="0" maxOccurs="1"/>
+        <xsd:element ref="dc:identifier" minOccurs="0" maxOccurs="1"/>
+        <xsd:element name="contentType" minOccurs="0" maxOccurs="1" type="xsd:string" ma:index="0" ma:displayName="Content Type"/>
+        <xsd:element ref="dc:title" minOccurs="0" maxOccurs="1" ma:index="4" ma:displayName="Title"/>
+        <xsd:element ref="dc:subject" minOccurs="0" maxOccurs="1"/>
+        <xsd:element ref="dc:description" minOccurs="0" maxOccurs="1"/>
+        <xsd:element name="keywords" minOccurs="0" maxOccurs="1" type="xsd:string"/>
+        <xsd:element ref="dc:language" minOccurs="0" maxOccurs="1"/>
+        <xsd:element name="category" minOccurs="0" maxOccurs="1" type="xsd:string"/>
+        <xsd:element name="version" minOccurs="0" maxOccurs="1" type="xsd:string"/>
+        <xsd:element name="revision" minOccurs="0" maxOccurs="1" type="xsd:string">
+          <xsd:annotation>
+            <xsd:documentation>
+                        This value indicates the number of saves or revisions. The application is responsible for updating this value after each revision.
+                    </xsd:documentation>
+          </xsd:annotation>
+        </xsd:element>
+        <xsd:element name="lastModifiedBy" minOccurs="0" maxOccurs="1" type="xsd:string"/>
+        <xsd:element ref="dcterms:modified" minOccurs="0" maxOccurs="1"/>
+        <xsd:element name="contentStatus" minOccurs="0" maxOccurs="1" type="xsd:string"/>
+      </xsd:all>
+    </xsd:complexType>
+  </xsd:schema>
+  <xs:schema xmlns:pc="http://schemas.microsoft.com/office/infopath/2007/PartnerControls" xmlns:xs="http://www.w3.org/2001/XMLSchema" targetNamespace="http://schemas.microsoft.com/office/infopath/2007/PartnerControls" elementFormDefault="qualified" attributeFormDefault="unqualified">
+    <xs:element name="Person">
+      <xs:complexType>
+        <xs:sequence>
+          <xs:element ref="pc:DisplayName" minOccurs="0"/>
+          <xs:element ref="pc:AccountId" minOccurs="0"/>
+          <xs:element ref="pc:AccountType" minOccurs="0"/>
+        </xs:sequence>
+      </xs:complexType>
+    </xs:element>
+    <xs:element name="DisplayName" type="xs:string"/>
+    <xs:element name="AccountId" type="xs:string"/>
+    <xs:element name="AccountType" type="xs:string"/>
+    <xs:element name="BDCAssociatedEntity">
+      <xs:complexType>
+        <xs:sequence>
+          <xs:element ref="pc:BDCEntity" minOccurs="0" maxOccurs="unbounded"/>
+        </xs:sequence>
+        <xs:attribute ref="pc:EntityNamespace"/>
+        <xs:attribute ref="pc:EntityName"/>
+        <xs:attribute ref="pc:SystemInstanceName"/>
+        <xs:attribute ref="pc:AssociationName"/>
+      </xs:complexType>
+    </xs:element>
+    <xs:attribute name="EntityNamespace" type="xs:string"/>
+    <xs:attribute name="EntityName" type="xs:string"/>
+    <xs:attribute name="SystemInstanceName" type="xs:string"/>
+    <xs:attribute name="AssociationName" type="xs:string"/>
+    <xs:element name="BDCEntity">
+      <xs:complexType>
+        <xs:sequence>
+          <xs:element ref="pc:EntityDisplayName" minOccurs="0"/>
+          <xs:element ref="pc:EntityInstanceReference" minOccurs="0"/>
+          <xs:element ref="pc:EntityId1" minOccurs="0"/>
+          <xs:element ref="pc:EntityId2" minOccurs="0"/>
+          <xs:element ref="pc:EntityId3" minOccurs="0"/>
+          <xs:element ref="pc:EntityId4" minOccurs="0"/>
+          <xs:element ref="pc:EntityId5" minOccurs="0"/>
+        </xs:sequence>
+      </xs:complexType>
+    </xs:element>
+    <xs:element name="EntityDisplayName" type="xs:string"/>
+    <xs:element name="EntityInstanceReference" type="xs:string"/>
+    <xs:element name="EntityId1" type="xs:string"/>
+    <xs:element name="EntityId2" type="xs:string"/>
+    <xs:element name="EntityId3" type="xs:string"/>
+    <xs:element name="EntityId4" type="xs:string"/>
+    <xs:element name="EntityId5" type="xs:string"/>
+    <xs:element name="Terms">
+      <xs:complexType>
+        <xs:sequence>
+          <xs:element ref="pc:TermInfo" minOccurs="0" maxOccurs="unbounded"/>
+        </xs:sequence>
+      </xs:complexType>
+    </xs:element>
+    <xs:element name="TermInfo">
+      <xs:complexType>
+        <xs:sequence>
+          <xs:element ref="pc:TermName" minOccurs="0"/>
+          <xs:element ref="pc:TermId" minOccurs="0"/>
+        </xs:sequence>
+      </xs:complexType>
+    </xs:element>
+    <xs:element name="TermName" type="xs:string"/>
+    <xs:element name="TermId" type="xs:string"/>
+  </xs:schema>
+</ct:contentTypeSchema>
+</file>
+
+<file path=customXml/item2.xml><?xml version="1.0" encoding="utf-8"?>
+<?mso-contentType ?>
+<FormTemplates xmlns="http://schemas.microsoft.com/sharepoint/v3/contenttype/forms">
+  <Display>DocumentLibraryForm</Display>
+  <Edit>DocumentLibraryForm</Edit>
+  <New>DocumentLibraryForm</New>
+</FormTemplates>
+</file>
+
+<file path=customXml/item3.xml><?xml version="1.0" encoding="utf-8"?>
+<p:properties xmlns:p="http://schemas.microsoft.com/office/2006/metadata/properties" xmlns:xsi="http://www.w3.org/2001/XMLSchema-instance" xmlns:pc="http://schemas.microsoft.com/office/infopath/2007/PartnerControls">
+  <documentManagement>
+    <_activity xmlns="937081f2-661d-4493-9d28-7214e1e6d6f0" xsi:nil="true"/>
+  </documentManagement>
+</p:properties>
+</file>
+
+<file path=customXml/itemProps1.xml><?xml version="1.0" encoding="utf-8"?>
+<ds:datastoreItem xmlns:ds="http://schemas.openxmlformats.org/officeDocument/2006/customXml" ds:itemID="{80D89529-8F92-4693-A6A7-DEF28156A7C2}">
+  <ds:schemaRefs>
+    <ds:schemaRef ds:uri="http://schemas.microsoft.com/office/2006/metadata/contentType"/>
+    <ds:schemaRef ds:uri="http://schemas.microsoft.com/office/2006/metadata/properties/metaAttributes"/>
+    <ds:schemaRef ds:uri="http://www.w3.org/2001/XMLSchema"/>
+    <ds:schemaRef ds:uri="http://schemas.microsoft.com/office/2006/metadata/properties"/>
+    <ds:schemaRef ds:uri="937081f2-661d-4493-9d28-7214e1e6d6f0"/>
+    <ds:schemaRef ds:uri="5a52e74c-1c86-40cb-b161-6acf8542837e"/>
+    <ds:schemaRef ds:uri="http://schemas.microsoft.com/office/2006/documentManagement/types"/>
+    <ds:schemaRef ds:uri="http://schemas.microsoft.com/office/infopath/2007/PartnerControls"/>
+    <ds:schemaRef ds:uri="http://schemas.openxmlformats.org/package/2006/metadata/core-properties"/>
+    <ds:schemaRef ds:uri="http://purl.org/dc/elements/1.1/"/>
+    <ds:schemaRef ds:uri="http://purl.org/dc/terms/"/>
+    <ds:schemaRef ds:uri="http://schemas.microsoft.com/internal/obd"/>
+  </ds:schemaRefs>
+</ds:datastoreItem>
+</file>
+
+<file path=customXml/itemProps2.xml><?xml version="1.0" encoding="utf-8"?>
+<ds:datastoreItem xmlns:ds="http://schemas.openxmlformats.org/officeDocument/2006/customXml" ds:itemID="{0E7E437A-26B6-48A9-9762-CF8CB0033154}">
+  <ds:schemaRefs>
+    <ds:schemaRef ds:uri="http://schemas.microsoft.com/sharepoint/v3/contenttype/forms"/>
+  </ds:schemaRefs>
+</ds:datastoreItem>
+</file>
+
+<file path=customXml/itemProps3.xml><?xml version="1.0" encoding="utf-8"?>
+<ds:datastoreItem xmlns:ds="http://schemas.openxmlformats.org/officeDocument/2006/customXml" ds:itemID="{D7836B0C-F4ED-4A2D-B559-293F4199FA42}">
+  <ds:schemaRefs>
+    <ds:schemaRef ds:uri="http://purl.org/dc/dcmitype/"/>
+    <ds:schemaRef ds:uri="http://schemas.microsoft.com/office/2006/metadata/properties"/>
+    <ds:schemaRef ds:uri="http://purl.org/dc/elements/1.1/"/>
+    <ds:schemaRef ds:uri="http://schemas.microsoft.com/office/2006/documentManagement/types"/>
+    <ds:schemaRef ds:uri="http://purl.org/dc/terms/"/>
+    <ds:schemaRef ds:uri="http://schemas.microsoft.com/office/infopath/2007/PartnerControls"/>
+    <ds:schemaRef ds:uri="http://schemas.openxmlformats.org/package/2006/metadata/core-properties"/>
+    <ds:schemaRef ds:uri="5a52e74c-1c86-40cb-b161-6acf8542837e"/>
+    <ds:schemaRef ds:uri="937081f2-661d-4493-9d28-7214e1e6d6f0"/>
+    <ds:schemaRef ds:uri="http://www.w3.org/XML/1998/namespace"/>
+  </ds:schemaRefs>
+</ds:datastoreItem>
 </file>
</xml_diff>